<commit_message>
Sync workshop-site subfolder: MTA roundel in hero, Salesforce brand fonts, nav simplified
</commit_message>
<xml_diff>
--- a/workshop-site/labs/Lab 01.5 - Participant.docx
+++ b/workshop-site/labs/Lab 01.5 - Participant.docx
@@ -86,6 +86,22 @@
       <w:r>
         <w:rPr>
           <w:b/>
+          <w:color w:val="2E75B6"/>
+        </w:rPr>
+        <w:t xml:space="preserve">Where to get the files: </w:t>
+      </w:r>
+      <w:r>
+        <w:t>The three CSV files you'll load are on the workshop website in the Resources tab, under the "Lab 1.5 Downloads" section. Click each link to download MTA Sample Accounts.csv, MTA Sample Contacts.csv, and MTA Sample Cases.csv to your laptop before you start Part 1.</w:t>
+      </w:r>
+    </w:p>
+    <w:p>
+      <w:pPr>
+        <w:spacing w:before="80" w:after="80"/>
+        <w:ind w:left="227"/>
+      </w:pPr>
+      <w:r>
+        <w:rPr>
+          <w:b/>
           <w:color w:val="4E7D3B"/>
         </w:rPr>
         <w:t xml:space="preserve">Why this matters: </w:t>
@@ -122,7 +138,7 @@
         <w:spacing w:after="40"/>
       </w:pPr>
       <w:r>
-        <w:t>You have the three CSV files downloaded. They are available on the workshop website under Resources &gt; Lab 1.5 Downloads, or distributed by your instructor via USB / shared drive.</w:t>
+        <w:t>You have the three CSV files downloaded to your laptop. Grab them from the workshop website: Resources tab, scroll to the "Lab 1.5 Downloads" section. Click each link to download.</w:t>
       </w:r>
     </w:p>
     <w:p>

</xml_diff>

<commit_message>
Lab 1.5: remove Accounts CSV (now pre-loaded via 01b); drop Part 1, renumber Parts, update preview and Resources
</commit_message>
<xml_diff>
--- a/workshop-site/labs/Lab 01.5 - Participant.docx
+++ b/workshop-site/labs/Lab 01.5 - Participant.docx
@@ -25,7 +25,7 @@
           <w:color w:val="6A6A6A"/>
           <w:sz w:val="20"/>
         </w:rPr>
-        <w:t>ServicePulse 360 Workshop v0.7 (revision 1) | Estimated time: 10 minutes | Use the native Salesforce Data Import Wizard to load realistic MTA Accounts, Contacts, and Cases into your org. These records populate the related lists and reports you build across the rest of Day 1 and Day 2.</w:t>
+        <w:t>ServicePulse 360 Workshop v0.7 (revision 2) | Estimated time: 8 minutes | Use the native Salesforce Data Import Wizard to load realistic MTA Contacts and Cases into your org. The 4 MTA agency Accounts are already pre-loaded. These records populate the related lists and reports you build across the rest of Day 1 and Day 2.</w:t>
       </w:r>
     </w:p>
     <w:p>
@@ -43,21 +43,12 @@
     </w:p>
     <w:p>
       <w:r>
-        <w:t>In Lab 1 you extended Case for multi-agency intake and built a Golden Case from scratch. The rest of Day 1 and Day 2 is more interesting when there is a realistic volume of records to work with: related lists populate, reports have shape, dashboards show patterns. Rather than ask you to manually create 10 Cases + 4 Accounts + 4 Contacts (about 25 minutes of clicking), you'll load them in bulk using the Data Import Wizard that ships with every Salesforce org.</w:t>
+        <w:t>In Lab 1 you extended Case for multi-agency intake and built a Golden Case from scratch. The rest of Day 1 and Day 2 is more interesting when there is a realistic volume of records to work with: related lists populate, reports have shape, dashboards show patterns. Rather than ask you to manually create 10 Cases + 4 Contacts (about 15 minutes of clicking), you'll load them in bulk using the Data Import Wizard that ships with every Salesforce org. The 4 MTA agency Accounts are already in your org from the pre-workshop deploy.</w:t>
       </w:r>
     </w:p>
     <w:p>
       <w:r>
-        <w:t>Three self-service imports in sequence (each ~2 minutes):</w:t>
-      </w:r>
-    </w:p>
-    <w:p>
-      <w:pPr>
-        <w:pStyle w:val="ListBullet"/>
-        <w:spacing w:after="40"/>
-      </w:pPr>
-      <w:r>
-        <w:t>4 MTA agency Accounts (NYCT, LIRR, MNR, B&amp;T)</w:t>
+        <w:t>Two self-service imports in sequence (each ~2-4 minutes):</w:t>
       </w:r>
     </w:p>
     <w:p>
@@ -88,11 +79,9 @@
           <w:b/>
           <w:color w:val="2E75B6"/>
         </w:rPr>
-        <w:t xml:space="preserve">Where to get the files: </w:t>
+        <w:t>Where to get the files: The two CSV files you'll load are on the workshop website in the Resources tab, under the "Lab 1.5 Downloads" section. Click each link to download MTA Sample Contacts.csv and MTA Sample Cases.csv to your laptop before you start Part 1.</w:t>
       </w:r>
-      <w:r>
-        <w:t>The three CSV files you'll load are on the workshop website in the Resources tab, under the "Lab 1.5 Downloads" section. Click each link to download MTA Sample Accounts.csv, MTA Sample Contacts.csv, and MTA Sample Cases.csv to your laptop before you start Part 1.</w:t>
-      </w:r>
+      <w:r/>
     </w:p>
     <w:p>
       <w:pPr>
@@ -138,19 +127,7 @@
         <w:spacing w:after="40"/>
       </w:pPr>
       <w:r>
-        <w:t>You have the three CSV files downloaded to your laptop. Grab them from the workshop website: Resources tab, scroll to the "Lab 1.5 Downloads" section. Click each link to download.</w:t>
-      </w:r>
-    </w:p>
-    <w:p>
-      <w:pPr>
-        <w:spacing w:after="40"/>
-        <w:ind w:left="680" w:hanging="227"/>
-      </w:pPr>
-      <w:r>
-        <w:t xml:space="preserve">• </w:t>
-      </w:r>
-      <w:r>
-        <w:t>MTA Sample Accounts.csv</w:t>
+        <w:t>You have the two CSV files downloaded to your laptop. Grab them from the workshop website: Resources tab, scroll to the "Lab 1.5 Downloads" section. Click each link to download.</w:t>
       </w:r>
     </w:p>
     <w:p>
@@ -187,222 +164,7 @@
           <w:color w:val="1F4E79"/>
           <w:sz w:val="28"/>
         </w:rPr>
-        <w:t>Part 1 - Load the Accounts (2 min)</w:t>
-      </w:r>
-    </w:p>
-    <w:p>
-      <w:pPr>
-        <w:spacing w:after="40"/>
-        <w:ind w:left="340" w:hanging="340"/>
-      </w:pPr>
-      <w:r>
-        <w:rPr>
-          <w:b/>
-        </w:rPr>
-        <w:t xml:space="preserve">1. </w:t>
-      </w:r>
-      <w:r>
-        <w:t>From Setup, Quick Find: Data Import Wizard, click Data Import Wizard.</w:t>
-      </w:r>
-    </w:p>
-    <w:p>
-      <w:pPr>
-        <w:spacing w:after="40"/>
-        <w:ind w:left="340" w:hanging="340"/>
-      </w:pPr>
-      <w:r>
-        <w:rPr>
-          <w:b/>
-        </w:rPr>
-        <w:t xml:space="preserve">2. </w:t>
-      </w:r>
-      <w:r>
-        <w:t>Click Launch Wizard!</w:t>
-      </w:r>
-    </w:p>
-    <w:p>
-      <w:pPr>
-        <w:spacing w:after="40"/>
-        <w:ind w:left="340" w:hanging="340"/>
-      </w:pPr>
-      <w:r>
-        <w:rPr>
-          <w:b/>
-        </w:rPr>
-        <w:t xml:space="preserve">3. </w:t>
-      </w:r>
-      <w:r>
-        <w:t>What kind of data are you importing? Click the Accounts and Contacts tile.</w:t>
-      </w:r>
-    </w:p>
-    <w:p>
-      <w:pPr>
-        <w:spacing w:after="40"/>
-        <w:ind w:left="340" w:hanging="340"/>
-      </w:pPr>
-      <w:r>
-        <w:rPr>
-          <w:b/>
-        </w:rPr>
-        <w:t xml:space="preserve">4. </w:t>
-      </w:r>
-      <w:r>
-        <w:t>What do you want to do? Select the Add new records radio button.</w:t>
-      </w:r>
-    </w:p>
-    <w:p>
-      <w:pPr>
-        <w:spacing w:after="40"/>
-        <w:ind w:left="340" w:hanging="340"/>
-      </w:pPr>
-      <w:r>
-        <w:rPr>
-          <w:b/>
-        </w:rPr>
-        <w:t xml:space="preserve">5. </w:t>
-      </w:r>
-      <w:r>
-        <w:t>Where is your data located? Choose CSV. Click Choose File and select MTA Sample Accounts.csv. Click Next.</w:t>
-      </w:r>
-    </w:p>
-    <w:p>
-      <w:pPr>
-        <w:spacing w:after="40"/>
-        <w:ind w:left="340" w:hanging="340"/>
-      </w:pPr>
-      <w:r>
-        <w:rPr>
-          <w:b/>
-        </w:rPr>
-        <w:t xml:space="preserve">6. </w:t>
-      </w:r>
-      <w:r>
-        <w:t>The Edit Field Mapping screen appears. The Wizard auto-maps most columns. Verify:</w:t>
-      </w:r>
-    </w:p>
-    <w:p>
-      <w:pPr>
-        <w:spacing w:after="40"/>
-        <w:ind w:left="680" w:hanging="227"/>
-      </w:pPr>
-      <w:r>
-        <w:t xml:space="preserve">• </w:t>
-      </w:r>
-      <w:r>
-        <w:t>Name maps to Account: Account Name</w:t>
-      </w:r>
-    </w:p>
-    <w:p>
-      <w:pPr>
-        <w:spacing w:after="40"/>
-        <w:ind w:left="680" w:hanging="227"/>
-      </w:pPr>
-      <w:r>
-        <w:t xml:space="preserve">• </w:t>
-      </w:r>
-      <w:r>
-        <w:t>Industry maps to Account: Industry</w:t>
-      </w:r>
-    </w:p>
-    <w:p>
-      <w:pPr>
-        <w:spacing w:after="40"/>
-        <w:ind w:left="680" w:hanging="227"/>
-      </w:pPr>
-      <w:r>
-        <w:t xml:space="preserve">• </w:t>
-      </w:r>
-      <w:r>
-        <w:t>Description maps to Account: Description</w:t>
-      </w:r>
-    </w:p>
-    <w:p>
-      <w:pPr>
-        <w:spacing w:after="40"/>
-        <w:ind w:left="340" w:hanging="340"/>
-      </w:pPr>
-      <w:r>
-        <w:rPr>
-          <w:b/>
-        </w:rPr>
-        <w:t xml:space="preserve">7. </w:t>
-      </w:r>
-      <w:r>
-        <w:t>Click Next.</w:t>
-      </w:r>
-    </w:p>
-    <w:p>
-      <w:pPr>
-        <w:spacing w:after="40"/>
-        <w:ind w:left="340" w:hanging="340"/>
-      </w:pPr>
-      <w:r>
-        <w:rPr>
-          <w:b/>
-        </w:rPr>
-        <w:t xml:space="preserve">8. </w:t>
-      </w:r>
-      <w:r>
-        <w:t>Review and click Start Import.</w:t>
-      </w:r>
-    </w:p>
-    <w:p>
-      <w:pPr>
-        <w:spacing w:after="40"/>
-        <w:ind w:left="340" w:hanging="340"/>
-      </w:pPr>
-      <w:r>
-        <w:rPr>
-          <w:b/>
-        </w:rPr>
-        <w:t xml:space="preserve">9. </w:t>
-      </w:r>
-      <w:r>
-        <w:t>Click OK on the confirmation. The Wizard shows a progress indicator.</w:t>
-      </w:r>
-    </w:p>
-    <w:p>
-      <w:pPr>
-        <w:spacing w:after="40"/>
-        <w:ind w:left="340" w:hanging="340"/>
-      </w:pPr>
-      <w:r>
-        <w:rPr>
-          <w:b/>
-        </w:rPr>
-        <w:t xml:space="preserve">10. </w:t>
-      </w:r>
-      <w:r>
-        <w:t>Open the Accounts tab to confirm all 4 MTA Accounts loaded. If the import takes more than 60 seconds, check your email for the import summary Salesforce sends on completion.</w:t>
-      </w:r>
-    </w:p>
-    <w:p>
-      <w:pPr>
-        <w:spacing w:before="80" w:after="80"/>
-        <w:ind w:left="227"/>
-      </w:pPr>
-      <w:r>
-        <w:rPr>
-          <w:b/>
-          <w:color w:val="B45F06"/>
-        </w:rPr>
-        <w:t xml:space="preserve">Watch out: </w:t>
-      </w:r>
-      <w:r>
-        <w:t>The 'Accounts and Contacts' tile is correct even if you're only loading Accounts right now. The Wizard supports loading either or both. Don't pick the 'Person Accounts' option unless your org is configured for Person Accounts (this one is not).</w:t>
-      </w:r>
-    </w:p>
-    <w:p>
-      <w:pPr>
-        <w:spacing w:before="280" w:after="80"/>
-      </w:pPr>
-      <w:r>
-        <w:rPr>
-          <w:b/>
-          <w:color w:val="1F4E79"/>
-          <w:sz w:val="28"/>
-        </w:rPr>
-        <w:t>Part 2 - Load the Contacts (2 min)</w:t>
+        <w:t>Part 1 - Load the Contacts (2 min)</w:t>
       </w:r>
     </w:p>
     <w:p>
@@ -598,11 +360,9 @@
           <w:b/>
           <w:color w:val="2E75B6"/>
         </w:rPr>
-        <w:t xml:space="preserve">Tip: </w:t>
+        <w:t>Tip: The Wizard matches 'Account Name' text to the actual Account record by name. If any Contact fails to link, check that the Account name in your CSV matches the pre-loaded MTA Account exactly (including the 'MTA' prefix).</w:t>
       </w:r>
-      <w:r>
-        <w:t>The Wizard matches 'Account Name' text to the actual Account record by name. If any Contact fails to link, check that the Account name in your CSV matches the Account you loaded in Part 1 exactly (including the 'MTA' prefix).</w:t>
-      </w:r>
+      <w:r/>
     </w:p>
     <w:p>
       <w:pPr>
@@ -614,7 +374,7 @@
           <w:color w:val="1F4E79"/>
           <w:sz w:val="28"/>
         </w:rPr>
-        <w:t>Part 3 - Load the Cases (4 min)</w:t>
+        <w:t>Part 2 - Load the Cases (4 min)</w:t>
       </w:r>
     </w:p>
     <w:p>
@@ -961,7 +721,7 @@
     </w:p>
     <w:p>
       <w:r>
-        <w:t>Three quick checks to confirm the import worked:</w:t>
+        <w:t>Two quick checks to confirm the import worked:</w:t>
       </w:r>
     </w:p>
     <w:p>
@@ -973,11 +733,9 @@
         <w:rPr>
           <w:b/>
         </w:rPr>
-        <w:t xml:space="preserve">1. </w:t>
+        <w:t>1. Contacts tab: 4 Operations Dispatcher Contacts.</w:t>
       </w:r>
-      <w:r>
-        <w:t>Accounts tab: 4 MTA Accounts (NYCT, LIRR, MNR, B&amp;T).</w:t>
-      </w:r>
+      <w:r/>
     </w:p>
     <w:p>
       <w:pPr>
@@ -988,26 +746,9 @@
         <w:rPr>
           <w:b/>
         </w:rPr>
-        <w:t xml:space="preserve">2. </w:t>
+        <w:t>2. Cases tab, All list view: 10 seed Cases plus your Golden Case = 11 total.</w:t>
       </w:r>
-      <w:r>
-        <w:t>Contacts tab: 4 Operations Dispatcher Contacts.</w:t>
-      </w:r>
-    </w:p>
-    <w:p>
-      <w:pPr>
-        <w:spacing w:after="40"/>
-        <w:ind w:left="340" w:hanging="340"/>
-      </w:pPr>
-      <w:r>
-        <w:rPr>
-          <w:b/>
-        </w:rPr>
-        <w:t xml:space="preserve">3. </w:t>
-      </w:r>
-      <w:r>
-        <w:t>Cases tab, All list view: 10 seed Cases plus your Golden Case = 11 total.</w:t>
-      </w:r>
+      <w:r/>
     </w:p>
     <w:p>
       <w:pPr>

</xml_diff>

<commit_message>
Lab 1.5 tour rewrite, Lab 2 dry-run fixes (L2-1 through L2-6), 01b pre-loads full sample data, remove CSVs
</commit_message>
<xml_diff>
--- a/workshop-site/labs/Lab 01.5 - Participant.docx
+++ b/workshop-site/labs/Lab 01.5 - Participant.docx
@@ -12,7 +12,7 @@
           <w:color w:val="1F4E79"/>
           <w:sz w:val="40"/>
         </w:rPr>
-        <w:t>Lab 1.5 - Load MTA Sample Data</w:t>
+        <w:t>Lab 1.5 - Tour your Pre-Loaded MTA Data</w:t>
       </w:r>
     </w:p>
     <w:p>
@@ -25,7 +25,7 @@
           <w:color w:val="6A6A6A"/>
           <w:sz w:val="20"/>
         </w:rPr>
-        <w:t>ServicePulse 360 Workshop v0.7 (revision 2) | Estimated time: 8 minutes | Use the native Salesforce Data Import Wizard to load realistic MTA Contacts and Cases into your org. The 4 MTA agency Accounts are already pre-loaded. These records populate the related lists and reports you build across the rest of Day 1 and Day 2.</w:t>
+        <w:t>ServicePulse 360 Workshop v0.7 (revision 3) | Estimated time: 5 minutes | Your org arrived with realistic MTA sample data already loaded. Tour it, understand what's there, and spot-check the records that downstream labs will reference.</w:t>
       </w:r>
     </w:p>
     <w:p>
@@ -38,17 +38,22 @@
           <w:color w:val="1F4E79"/>
           <w:sz w:val="28"/>
         </w:rPr>
-        <w:t>What you're building and why</w:t>
+        <w:t>What you're doing and why</w:t>
       </w:r>
     </w:p>
     <w:p>
       <w:r>
-        <w:t>In Lab 1 you extended Case for multi-agency intake and built a Golden Case from scratch. The rest of Day 1 and Day 2 is more interesting when there is a realistic volume of records to work with: related lists populate, reports have shape, dashboards show patterns. Rather than ask you to manually create 10 Cases + 4 Contacts (about 15 minutes of clicking), you'll load them in bulk using the Data Import Wizard that ships with every Salesforce org. The 4 MTA agency Accounts are already in your org from the pre-workshop deploy.</w:t>
+        <w:t>In Lab 1 you extended Case for multi-agency intake and built one Golden Case from scratch. The rest of Day 1 and Day 2 is more interesting when there is a realistic volume of records to work with: related lists populate, reports have shape, dashboards show patterns.</w:t>
       </w:r>
     </w:p>
     <w:p>
       <w:r>
-        <w:t>Two self-service imports in sequence (each ~2-4 minutes):</w:t>
+        <w:t>Your workshop org arrived with the realistic MTA dataset already loaded. You don't need to import it. This short lab is a tour so you understand what's there before you build against it.</w:t>
+      </w:r>
+    </w:p>
+    <w:p>
+      <w:r>
+        <w:t>Pre-loaded via the pre-workshop deploy (sf data tree import):</w:t>
       </w:r>
     </w:p>
     <w:p>
@@ -57,7 +62,7 @@
         <w:spacing w:after="40"/>
       </w:pPr>
       <w:r>
-        <w:t>4 Operations Dispatcher Contacts (one per agency)</w:t>
+        <w:t>4 MTA agency Accounts (NYCT, LIRR, MNR, B&amp;T)</w:t>
       </w:r>
     </w:p>
     <w:p>
@@ -66,22 +71,17 @@
         <w:spacing w:after="40"/>
       </w:pPr>
       <w:r>
-        <w:t>10 realistic MTA Cases distributed across the four agencies with varied priorities and types</w:t>
+        <w:t>4 Operations Dispatcher Contacts (one per agency: Marcus Chen for NYCT, Priya Patel for LIRR, Elena Rodriguez for MNR, James O'Brien for B&amp;T)</w:t>
       </w:r>
     </w:p>
     <w:p>
       <w:pPr>
-        <w:spacing w:before="80" w:after="80"/>
-        <w:ind w:left="227"/>
+        <w:pStyle w:val="ListBullet"/>
+        <w:spacing w:after="40"/>
       </w:pPr>
       <w:r>
-        <w:rPr>
-          <w:b/>
-          <w:color w:val="2E75B6"/>
-        </w:rPr>
-        <w:t>Where to get the files: The two CSV files you'll load are on the workshop website in the Resources tab, under the "Lab 1.5 Downloads" section. Click each link to download MTA Sample Contacts.csv and MTA Sample Cases.csv to your laptop before you start Part 1.</w:t>
+        <w:t>10 realistic seed Cases distributed across the four agencies with varied priorities and types</w:t>
       </w:r>
-      <w:r/>
     </w:p>
     <w:p>
       <w:pPr>
@@ -96,7 +96,23 @@
         <w:t xml:space="preserve">Why this matters: </w:t>
       </w:r>
       <w:r>
-        <w:t>The Data Import Wizard is the right tool for admin-level bulk data loads up to 50,000 records at a time. It is zero-code, scales well, and respects validation rules. For bigger loads you'd use Data Loader (desktop tool) or an integration. Knowing which tool to pick for which load size is a core admin skill.</w:t>
+        <w:t>In production, bulk data loads happen via Data Loader, an integration (like MuleSoft), or sf data tree import. The Salesforce Data Import Wizard handles most objects but has edition-specific gaps around Case loading in Pronto DE orgs. Knowing which tool to pick for which situation is a core admin skill.</w:t>
+      </w:r>
+    </w:p>
+    <w:p>
+      <w:pPr>
+        <w:spacing w:before="80" w:after="80"/>
+        <w:ind w:left="227"/>
+      </w:pPr>
+      <w:r>
+        <w:rPr>
+          <w:b/>
+          <w:color w:val="2E75B6"/>
+        </w:rPr>
+        <w:t xml:space="preserve">Why Case Record Type shows '-' or Master: </w:t>
+      </w:r>
+      <w:r>
+        <w:t>The seed Cases load with Record Type = Master (null) because the 4 agency Record Types (NYCT/LIRR/MNR/BandT) did not exist on Case until you built them in Lab 1 Part 5. The pre-workshop deploy ran BEFORE Lab 1. In production you would backfill Record Types onto legacy data via a one-time Flow or Apex script; for this workshop, we leave seed Cases on Master and your Golden Case shows the NYCT Record Type you built yourself.</w:t>
       </w:r>
     </w:p>
     <w:p>
@@ -109,68 +125,13 @@
           <w:color w:val="1F4E79"/>
           <w:sz w:val="28"/>
         </w:rPr>
-        <w:t>Before you start</w:t>
+        <w:t>Part 1 - Tour the Accounts (1 min)</w:t>
       </w:r>
     </w:p>
     <w:p>
       <w:pPr>
-        <w:pStyle w:val="ListBullet"/>
-        <w:spacing w:after="40"/>
-      </w:pPr>
-      <w:r>
-        <w:t>Lab 1 is complete. Your org has NYCT, LIRR, MNR, and B&amp;T Record Types on Case.</w:t>
-      </w:r>
-    </w:p>
-    <w:p>
-      <w:pPr>
-        <w:pStyle w:val="ListBullet"/>
-        <w:spacing w:after="40"/>
-      </w:pPr>
-      <w:r>
-        <w:t>You have the two CSV files downloaded to your laptop. Grab them from the workshop website: Resources tab, scroll to the "Lab 1.5 Downloads" section. Click each link to download.</w:t>
-      </w:r>
-    </w:p>
-    <w:p>
-      <w:pPr>
-        <w:spacing w:after="40"/>
-        <w:ind w:left="680" w:hanging="227"/>
-      </w:pPr>
-      <w:r>
-        <w:t xml:space="preserve">• </w:t>
-      </w:r>
-      <w:r>
-        <w:t>MTA Sample Contacts.csv</w:t>
-      </w:r>
-    </w:p>
-    <w:p>
-      <w:pPr>
-        <w:spacing w:after="40"/>
-        <w:ind w:left="680" w:hanging="227"/>
-      </w:pPr>
-      <w:r>
-        <w:t xml:space="preserve">• </w:t>
-      </w:r>
-      <w:r>
-        <w:t>MTA Sample Cases.csv</w:t>
-      </w:r>
-    </w:p>
-    <w:p>
-      <w:pPr>
-        <w:spacing w:before="280" w:after="80"/>
-      </w:pPr>
-      <w:r>
-        <w:rPr>
-          <w:b/>
-          <w:color w:val="1F4E79"/>
-          <w:sz w:val="28"/>
-        </w:rPr>
-        <w:t>Part 1 - Load the Contacts (2 min)</w:t>
-      </w:r>
-    </w:p>
-    <w:p>
-      <w:pPr>
-        <w:spacing w:after="40"/>
-        <w:ind w:left="340" w:hanging="340"/>
+        <w:spacing w:after="60"/>
+        <w:ind w:left="454" w:hanging="454"/>
       </w:pPr>
       <w:r>
         <w:rPr>
@@ -179,13 +140,13 @@
         <w:t xml:space="preserve">1. </w:t>
       </w:r>
       <w:r>
-        <w:t>From Setup, Quick Find: Data Import Wizard, click Data Import Wizard.</w:t>
+        <w:t>App Launcher then Accounts.</w:t>
       </w:r>
     </w:p>
     <w:p>
       <w:pPr>
-        <w:spacing w:after="40"/>
-        <w:ind w:left="340" w:hanging="340"/>
+        <w:spacing w:after="60"/>
+        <w:ind w:left="454" w:hanging="454"/>
       </w:pPr>
       <w:r>
         <w:rPr>
@@ -194,13 +155,13 @@
         <w:t xml:space="preserve">2. </w:t>
       </w:r>
       <w:r>
-        <w:t>Click Launch Wizard!</w:t>
+        <w:t>Switch the list view to All Accounts (via the dropdown).</w:t>
       </w:r>
     </w:p>
     <w:p>
       <w:pPr>
-        <w:spacing w:after="40"/>
-        <w:ind w:left="340" w:hanging="340"/>
+        <w:spacing w:after="60"/>
+        <w:ind w:left="454" w:hanging="454"/>
       </w:pPr>
       <w:r>
         <w:rPr>
@@ -209,13 +170,13 @@
         <w:t xml:space="preserve">3. </w:t>
       </w:r>
       <w:r>
-        <w:t>Click the Accounts and Contacts tile.</w:t>
+        <w:t>In the search box above the list, type MTA. Confirm you see four Accounts: MTA New York City Transit, MTA Long Island Rail Road, MTA Metro-North Railroad, MTA Bridges and Tunnels.</w:t>
       </w:r>
     </w:p>
     <w:p>
       <w:pPr>
-        <w:spacing w:after="40"/>
-        <w:ind w:left="340" w:hanging="340"/>
+        <w:spacing w:after="60"/>
+        <w:ind w:left="454" w:hanging="454"/>
       </w:pPr>
       <w:r>
         <w:rPr>
@@ -224,470 +185,7 @@
         <w:t xml:space="preserve">4. </w:t>
       </w:r>
       <w:r>
-        <w:t>Select the Add new records radio button.</w:t>
-      </w:r>
-    </w:p>
-    <w:p>
-      <w:pPr>
-        <w:spacing w:after="40"/>
-        <w:ind w:left="340" w:hanging="340"/>
-      </w:pPr>
-      <w:r>
-        <w:rPr>
-          <w:b/>
-        </w:rPr>
-        <w:t xml:space="preserve">5. </w:t>
-      </w:r>
-      <w:r>
-        <w:t>Choose CSV. Click Choose File and select MTA Sample Contacts.csv. Click Next.</w:t>
-      </w:r>
-    </w:p>
-    <w:p>
-      <w:pPr>
-        <w:spacing w:after="40"/>
-        <w:ind w:left="340" w:hanging="340"/>
-      </w:pPr>
-      <w:r>
-        <w:rPr>
-          <w:b/>
-        </w:rPr>
-        <w:t xml:space="preserve">6. </w:t>
-      </w:r>
-      <w:r>
-        <w:t>Verify the mappings:</w:t>
-      </w:r>
-    </w:p>
-    <w:p>
-      <w:pPr>
-        <w:spacing w:after="40"/>
-        <w:ind w:left="680" w:hanging="227"/>
-      </w:pPr>
-      <w:r>
-        <w:t xml:space="preserve">• </w:t>
-      </w:r>
-      <w:r>
-        <w:t>FirstName maps to Contact: First Name</w:t>
-      </w:r>
-    </w:p>
-    <w:p>
-      <w:pPr>
-        <w:spacing w:after="40"/>
-        <w:ind w:left="680" w:hanging="227"/>
-      </w:pPr>
-      <w:r>
-        <w:t xml:space="preserve">• </w:t>
-      </w:r>
-      <w:r>
-        <w:t>LastName maps to Contact: Last Name</w:t>
-      </w:r>
-    </w:p>
-    <w:p>
-      <w:pPr>
-        <w:spacing w:after="40"/>
-        <w:ind w:left="680" w:hanging="227"/>
-      </w:pPr>
-      <w:r>
-        <w:t xml:space="preserve">• </w:t>
-      </w:r>
-      <w:r>
-        <w:t>Title maps to Contact: Title</w:t>
-      </w:r>
-    </w:p>
-    <w:p>
-      <w:pPr>
-        <w:spacing w:after="40"/>
-        <w:ind w:left="680" w:hanging="227"/>
-      </w:pPr>
-      <w:r>
-        <w:t xml:space="preserve">• </w:t>
-      </w:r>
-      <w:r>
-        <w:t>Account Name maps to Contact: Account Name (the Wizard uses this to look up the parent Account by name)</w:t>
-      </w:r>
-    </w:p>
-    <w:p>
-      <w:pPr>
-        <w:spacing w:after="40"/>
-        <w:ind w:left="340" w:hanging="340"/>
-      </w:pPr>
-      <w:r>
-        <w:rPr>
-          <w:b/>
-        </w:rPr>
-        <w:t xml:space="preserve">7. </w:t>
-      </w:r>
-      <w:r>
-        <w:t>Click Next.</w:t>
-      </w:r>
-    </w:p>
-    <w:p>
-      <w:pPr>
-        <w:spacing w:after="40"/>
-        <w:ind w:left="340" w:hanging="340"/>
-      </w:pPr>
-      <w:r>
-        <w:rPr>
-          <w:b/>
-        </w:rPr>
-        <w:t xml:space="preserve">8. </w:t>
-      </w:r>
-      <w:r>
-        <w:t>Click Start Import. Click OK.</w:t>
-      </w:r>
-    </w:p>
-    <w:p>
-      <w:pPr>
-        <w:spacing w:after="40"/>
-        <w:ind w:left="340" w:hanging="340"/>
-      </w:pPr>
-      <w:r>
-        <w:rPr>
-          <w:b/>
-        </w:rPr>
-        <w:t xml:space="preserve">9. </w:t>
-      </w:r>
-      <w:r>
-        <w:t>Open the Contacts tab and confirm all 4 Contacts loaded, each linked to the correct MTA Account.</w:t>
-      </w:r>
-    </w:p>
-    <w:p>
-      <w:pPr>
-        <w:spacing w:before="80" w:after="80"/>
-        <w:ind w:left="227"/>
-      </w:pPr>
-      <w:r>
-        <w:rPr>
-          <w:b/>
-          <w:color w:val="2E75B6"/>
-        </w:rPr>
-        <w:t>Tip: The Wizard matches 'Account Name' text to the actual Account record by name. If any Contact fails to link, check that the Account name in your CSV matches the pre-loaded MTA Account exactly (including the 'MTA' prefix).</w:t>
-      </w:r>
-      <w:r/>
-    </w:p>
-    <w:p>
-      <w:pPr>
-        <w:spacing w:before="280" w:after="80"/>
-      </w:pPr>
-      <w:r>
-        <w:rPr>
-          <w:b/>
-          <w:color w:val="1F4E79"/>
-          <w:sz w:val="28"/>
-        </w:rPr>
-        <w:t>Part 2 - Load the Cases (4 min)</w:t>
-      </w:r>
-    </w:p>
-    <w:p>
-      <w:pPr>
-        <w:spacing w:after="40"/>
-        <w:ind w:left="340" w:hanging="340"/>
-      </w:pPr>
-      <w:r>
-        <w:rPr>
-          <w:b/>
-        </w:rPr>
-        <w:t xml:space="preserve">1. </w:t>
-      </w:r>
-      <w:r>
-        <w:t>From Setup, Quick Find: Data Import Wizard, click Data Import Wizard.</w:t>
-      </w:r>
-    </w:p>
-    <w:p>
-      <w:pPr>
-        <w:spacing w:after="40"/>
-        <w:ind w:left="340" w:hanging="340"/>
-      </w:pPr>
-      <w:r>
-        <w:rPr>
-          <w:b/>
-        </w:rPr>
-        <w:t xml:space="preserve">2. </w:t>
-      </w:r>
-      <w:r>
-        <w:t>Click Launch Wizard!</w:t>
-      </w:r>
-    </w:p>
-    <w:p>
-      <w:pPr>
-        <w:spacing w:after="40"/>
-        <w:ind w:left="340" w:hanging="340"/>
-      </w:pPr>
-      <w:r>
-        <w:rPr>
-          <w:b/>
-        </w:rPr>
-        <w:t xml:space="preserve">3. </w:t>
-      </w:r>
-      <w:r>
-        <w:t>Click the Cases tile (under Custom objects, OR under the standard tiles depending on your org).</w:t>
-      </w:r>
-    </w:p>
-    <w:p>
-      <w:pPr>
-        <w:spacing w:before="80" w:after="80"/>
-        <w:ind w:left="227"/>
-      </w:pPr>
-      <w:r>
-        <w:rPr>
-          <w:b/>
-          <w:color w:val="B45F06"/>
-        </w:rPr>
-        <w:t xml:space="preserve">Watch out: </w:t>
-      </w:r>
-      <w:r>
-        <w:t>Case is a standard object but it is sometimes under the Custom objects section of the Wizard tile picker depending on org version. Look for a tile labeled 'Cases' with the Case icon.</w:t>
-      </w:r>
-    </w:p>
-    <w:p>
-      <w:pPr>
-        <w:spacing w:after="40"/>
-        <w:ind w:left="340" w:hanging="340"/>
-      </w:pPr>
-      <w:r>
-        <w:rPr>
-          <w:b/>
-        </w:rPr>
-        <w:t xml:space="preserve">4. </w:t>
-      </w:r>
-      <w:r>
-        <w:t>Select the Add new records radio button.</w:t>
-      </w:r>
-    </w:p>
-    <w:p>
-      <w:pPr>
-        <w:spacing w:after="40"/>
-        <w:ind w:left="340" w:hanging="340"/>
-      </w:pPr>
-      <w:r>
-        <w:rPr>
-          <w:b/>
-        </w:rPr>
-        <w:t xml:space="preserve">5. </w:t>
-      </w:r>
-      <w:r>
-        <w:t>Which Record Type do you want to use? Select Agent is based on Record Type Column in the import file. (Different orgs may label this slightly differently; the point is: use the Record Type column from the CSV, not a fixed Record Type.)</w:t>
-      </w:r>
-    </w:p>
-    <w:p>
-      <w:pPr>
-        <w:spacing w:after="40"/>
-        <w:ind w:left="340" w:hanging="340"/>
-      </w:pPr>
-      <w:r>
-        <w:rPr>
-          <w:b/>
-        </w:rPr>
-        <w:t xml:space="preserve">6. </w:t>
-      </w:r>
-      <w:r>
-        <w:t>Choose CSV. Click Choose File and select MTA Sample Cases.csv. Click Next.</w:t>
-      </w:r>
-    </w:p>
-    <w:p>
-      <w:pPr>
-        <w:spacing w:after="40"/>
-        <w:ind w:left="340" w:hanging="340"/>
-      </w:pPr>
-      <w:r>
-        <w:rPr>
-          <w:b/>
-        </w:rPr>
-        <w:t xml:space="preserve">7. </w:t>
-      </w:r>
-      <w:r>
-        <w:t>Verify the mappings:</w:t>
-      </w:r>
-    </w:p>
-    <w:p>
-      <w:pPr>
-        <w:spacing w:after="40"/>
-        <w:ind w:left="680" w:hanging="227"/>
-      </w:pPr>
-      <w:r>
-        <w:t xml:space="preserve">• </w:t>
-      </w:r>
-      <w:r>
-        <w:t>Subject maps to Case: Subject</w:t>
-      </w:r>
-    </w:p>
-    <w:p>
-      <w:pPr>
-        <w:spacing w:after="40"/>
-        <w:ind w:left="680" w:hanging="227"/>
-      </w:pPr>
-      <w:r>
-        <w:t xml:space="preserve">• </w:t>
-      </w:r>
-      <w:r>
-        <w:t>Status maps to Case: Status</w:t>
-      </w:r>
-    </w:p>
-    <w:p>
-      <w:pPr>
-        <w:spacing w:after="40"/>
-        <w:ind w:left="680" w:hanging="227"/>
-      </w:pPr>
-      <w:r>
-        <w:t xml:space="preserve">• </w:t>
-      </w:r>
-      <w:r>
-        <w:t>Priority maps to Case: Priority</w:t>
-      </w:r>
-    </w:p>
-    <w:p>
-      <w:pPr>
-        <w:spacing w:after="40"/>
-        <w:ind w:left="680" w:hanging="227"/>
-      </w:pPr>
-      <w:r>
-        <w:t xml:space="preserve">• </w:t>
-      </w:r>
-      <w:r>
-        <w:t>Origin maps to Case: Case Origin</w:t>
-      </w:r>
-    </w:p>
-    <w:p>
-      <w:pPr>
-        <w:spacing w:after="40"/>
-        <w:ind w:left="680" w:hanging="227"/>
-      </w:pPr>
-      <w:r>
-        <w:t xml:space="preserve">• </w:t>
-      </w:r>
-      <w:r>
-        <w:t>Type maps to Case: Case Type</w:t>
-      </w:r>
-    </w:p>
-    <w:p>
-      <w:pPr>
-        <w:spacing w:after="40"/>
-        <w:ind w:left="680" w:hanging="227"/>
-      </w:pPr>
-      <w:r>
-        <w:t xml:space="preserve">• </w:t>
-      </w:r>
-      <w:r>
-        <w:t>Account Name maps to Case: Account Name (looks up the Account by name)</w:t>
-      </w:r>
-    </w:p>
-    <w:p>
-      <w:pPr>
-        <w:spacing w:after="40"/>
-        <w:ind w:left="680" w:hanging="227"/>
-      </w:pPr>
-      <w:r>
-        <w:t xml:space="preserve">• </w:t>
-      </w:r>
-      <w:r>
-        <w:t>Contact Last Name maps to Case: Contact Last Name (looks up the Contact by last name)</w:t>
-      </w:r>
-    </w:p>
-    <w:p>
-      <w:pPr>
-        <w:spacing w:after="40"/>
-        <w:ind w:left="680" w:hanging="227"/>
-      </w:pPr>
-      <w:r>
-        <w:t xml:space="preserve">• </w:t>
-      </w:r>
-      <w:r>
-        <w:t>Record Type maps to Case: Record Type (looks up the Record Type by Developer Name)</w:t>
-      </w:r>
-    </w:p>
-    <w:p>
-      <w:pPr>
-        <w:spacing w:after="40"/>
-        <w:ind w:left="340" w:hanging="340"/>
-      </w:pPr>
-      <w:r>
-        <w:rPr>
-          <w:b/>
-        </w:rPr>
-        <w:t xml:space="preserve">8. </w:t>
-      </w:r>
-      <w:r>
-        <w:t>Click Next.</w:t>
-      </w:r>
-    </w:p>
-    <w:p>
-      <w:pPr>
-        <w:spacing w:after="40"/>
-        <w:ind w:left="340" w:hanging="340"/>
-      </w:pPr>
-      <w:r>
-        <w:rPr>
-          <w:b/>
-        </w:rPr>
-        <w:t xml:space="preserve">9. </w:t>
-      </w:r>
-      <w:r>
-        <w:t>Click Start Import. Click OK.</w:t>
-      </w:r>
-    </w:p>
-    <w:p>
-      <w:pPr>
-        <w:spacing w:after="40"/>
-        <w:ind w:left="340" w:hanging="340"/>
-      </w:pPr>
-      <w:r>
-        <w:rPr>
-          <w:b/>
-        </w:rPr>
-        <w:t xml:space="preserve">10. </w:t>
-      </w:r>
-      <w:r>
-        <w:t>Open the Cases tab and switch to the All list view. Confirm 10 new Cases loaded (plus your Golden Case from Lab 1 Part 10, so 11 total).</w:t>
-      </w:r>
-    </w:p>
-    <w:p>
-      <w:pPr>
-        <w:spacing w:after="40"/>
-        <w:ind w:left="340" w:hanging="340"/>
-      </w:pPr>
-      <w:r>
-        <w:rPr>
-          <w:b/>
-        </w:rPr>
-        <w:t xml:space="preserve">11. </w:t>
-      </w:r>
-      <w:r>
-        <w:t>Spot-check a few Cases:</w:t>
-      </w:r>
-    </w:p>
-    <w:p>
-      <w:pPr>
-        <w:spacing w:after="40"/>
-        <w:ind w:left="680" w:hanging="227"/>
-      </w:pPr>
-      <w:r>
-        <w:t xml:space="preserve">• </w:t>
-      </w:r>
-      <w:r>
-        <w:t>Open Seed: Signal fault on 7 Line, Vernon Blvd. Confirm Record Type = NYCT.</w:t>
-      </w:r>
-    </w:p>
-    <w:p>
-      <w:pPr>
-        <w:spacing w:after="40"/>
-        <w:ind w:left="680" w:hanging="227"/>
-      </w:pPr>
-      <w:r>
-        <w:t xml:space="preserve">• </w:t>
-      </w:r>
-      <w:r>
-        <w:t>Open Seed: Grade crossing malfunction, Mineola. Confirm Record Type = LIRR.</w:t>
-      </w:r>
-    </w:p>
-    <w:p>
-      <w:pPr>
-        <w:spacing w:after="40"/>
-        <w:ind w:left="680" w:hanging="227"/>
-      </w:pPr>
-      <w:r>
-        <w:t xml:space="preserve">• </w:t>
-      </w:r>
-      <w:r>
-        <w:t>Open Seed: Toll gantry sensor fault, Verrazzano. Confirm Record Type = B&amp;T (listed as BandT in the Developer Name).</w:t>
+        <w:t>Click MTA New York City Transit to open it. Notice the Related tab (or Related Lists section): you'll see Contacts and Cases related lists.</w:t>
       </w:r>
     </w:p>
     <w:p>
@@ -703,7 +201,261 @@
         <w:t xml:space="preserve">Verified? Great job!: </w:t>
       </w:r>
       <w:r>
-        <w:t>Your org now has a realistic multi-agency dataset. In Lab 2 you'll build Dynamic Forms against this; in Lab 3 you'll link Cases to Assets; in Lab 7 Agentforce will have real records to reason about.</w:t>
+        <w:t>Your 4 MTA agency Accounts are present and clickable.</w:t>
+      </w:r>
+    </w:p>
+    <w:p>
+      <w:pPr>
+        <w:spacing w:before="280" w:after="80"/>
+      </w:pPr>
+      <w:r>
+        <w:rPr>
+          <w:b/>
+          <w:color w:val="1F4E79"/>
+          <w:sz w:val="28"/>
+        </w:rPr>
+        <w:t>Part 2 - Tour the Contacts (1 min)</w:t>
+      </w:r>
+    </w:p>
+    <w:p>
+      <w:pPr>
+        <w:spacing w:after="60"/>
+        <w:ind w:left="454" w:hanging="454"/>
+      </w:pPr>
+      <w:r>
+        <w:rPr>
+          <w:b/>
+        </w:rPr>
+        <w:t xml:space="preserve">1. </w:t>
+      </w:r>
+      <w:r>
+        <w:t>App Launcher then Contacts.</w:t>
+      </w:r>
+    </w:p>
+    <w:p>
+      <w:pPr>
+        <w:spacing w:after="60"/>
+        <w:ind w:left="454" w:hanging="454"/>
+      </w:pPr>
+      <w:r>
+        <w:rPr>
+          <w:b/>
+        </w:rPr>
+        <w:t xml:space="preserve">2. </w:t>
+      </w:r>
+      <w:r>
+        <w:t>Switch the list view to All Contacts.</w:t>
+      </w:r>
+    </w:p>
+    <w:p>
+      <w:pPr>
+        <w:spacing w:after="60"/>
+        <w:ind w:left="454" w:hanging="454"/>
+      </w:pPr>
+      <w:r>
+        <w:rPr>
+          <w:b/>
+        </w:rPr>
+        <w:t xml:space="preserve">3. </w:t>
+      </w:r>
+      <w:r>
+        <w:t>You should see at least 4 contacts titled Operations Dispatcher: Marcus Chen, Priya Patel, Elena Rodriguez, James O'Brien. (The org may also have Pronto template Contacts; those are unrelated to the workshop.)</w:t>
+      </w:r>
+    </w:p>
+    <w:p>
+      <w:pPr>
+        <w:spacing w:after="60"/>
+        <w:ind w:left="454" w:hanging="454"/>
+      </w:pPr>
+      <w:r>
+        <w:rPr>
+          <w:b/>
+        </w:rPr>
+        <w:t xml:space="preserve">4. </w:t>
+      </w:r>
+      <w:r>
+        <w:t>Click Marcus Chen. Confirm his Account is MTA New York City Transit.</w:t>
+      </w:r>
+    </w:p>
+    <w:p>
+      <w:pPr>
+        <w:spacing w:before="80" w:after="80"/>
+        <w:ind w:left="227"/>
+      </w:pPr>
+      <w:r>
+        <w:rPr>
+          <w:b/>
+          <w:color w:val="5C3F92"/>
+        </w:rPr>
+        <w:t xml:space="preserve">Verified? Great job!: </w:t>
+      </w:r>
+      <w:r>
+        <w:t>4 Operations Dispatcher Contacts exist, each linked to the right MTA agency Account.</w:t>
+      </w:r>
+    </w:p>
+    <w:p>
+      <w:pPr>
+        <w:spacing w:before="280" w:after="80"/>
+      </w:pPr>
+      <w:r>
+        <w:rPr>
+          <w:b/>
+          <w:color w:val="1F4E79"/>
+          <w:sz w:val="28"/>
+        </w:rPr>
+        <w:t>Part 3 - Tour the Cases (2 min)</w:t>
+      </w:r>
+    </w:p>
+    <w:p>
+      <w:pPr>
+        <w:spacing w:after="60"/>
+        <w:ind w:left="454" w:hanging="454"/>
+      </w:pPr>
+      <w:r>
+        <w:rPr>
+          <w:b/>
+        </w:rPr>
+        <w:t xml:space="preserve">1. </w:t>
+      </w:r>
+      <w:r>
+        <w:t>App Launcher then Cases.</w:t>
+      </w:r>
+    </w:p>
+    <w:p>
+      <w:pPr>
+        <w:spacing w:after="60"/>
+        <w:ind w:left="454" w:hanging="454"/>
+      </w:pPr>
+      <w:r>
+        <w:rPr>
+          <w:b/>
+        </w:rPr>
+        <w:t xml:space="preserve">2. </w:t>
+      </w:r>
+      <w:r>
+        <w:t>Switch to the All list view. You should see 11 total: 10 seed Cases (Subject starts with 'Seed:') plus your Golden Case from Lab 1 Part 10.</w:t>
+      </w:r>
+    </w:p>
+    <w:p>
+      <w:pPr>
+        <w:spacing w:after="60"/>
+        <w:ind w:left="454" w:hanging="454"/>
+      </w:pPr>
+      <w:r>
+        <w:rPr>
+          <w:b/>
+        </w:rPr>
+        <w:t xml:space="preserve">3. </w:t>
+      </w:r>
+      <w:r>
+        <w:t>Spot-check a few seed Cases to see the distribution:</w:t>
+      </w:r>
+    </w:p>
+    <w:p>
+      <w:pPr>
+        <w:pStyle w:val="ListBullet"/>
+        <w:spacing w:after="40"/>
+      </w:pPr>
+      <w:r>
+        <w:t>Open 'Seed: Signal fault on 7 Line, Vernon Blvd'. Account: MTA New York City Transit. Contact: Marcus Chen. Type: Signal Issue. Priority: P2 - High.</w:t>
+      </w:r>
+    </w:p>
+    <w:p>
+      <w:pPr>
+        <w:pStyle w:val="ListBullet"/>
+        <w:spacing w:after="40"/>
+      </w:pPr>
+      <w:r>
+        <w:t>Open 'Seed: Grade crossing malfunction, Mineola'. Account: MTA Long Island Rail Road. Contact: Priya Patel. Priority: P1 - Critical.</w:t>
+      </w:r>
+    </w:p>
+    <w:p>
+      <w:pPr>
+        <w:pStyle w:val="ListBullet"/>
+        <w:spacing w:after="40"/>
+      </w:pPr>
+      <w:r>
+        <w:t>Open 'Seed: Toll gantry sensor fault, Verrazzano'. Account: MTA Bridges and Tunnels. Contact: James O'Brien. Type: Toll System Issue.</w:t>
+      </w:r>
+    </w:p>
+    <w:p>
+      <w:pPr>
+        <w:spacing w:after="60"/>
+        <w:ind w:left="454" w:hanging="454"/>
+      </w:pPr>
+      <w:r>
+        <w:rPr>
+          <w:b/>
+        </w:rPr>
+        <w:t xml:space="preserve">4. </w:t>
+      </w:r>
+      <w:r>
+        <w:t>Look at the Case Record Type column in the list view. Seed Cases show '-' (Master); your Golden Case shows 'NYCT'. This is intentional (see the callout above).</w:t>
+      </w:r>
+    </w:p>
+    <w:p>
+      <w:pPr>
+        <w:spacing w:before="80" w:after="80"/>
+        <w:ind w:left="227"/>
+      </w:pPr>
+      <w:r>
+        <w:rPr>
+          <w:b/>
+          <w:color w:val="5C3F92"/>
+        </w:rPr>
+        <w:t xml:space="preserve">Verified? Great job!: </w:t>
+      </w:r>
+      <w:r>
+        <w:t>You have 10 seed Cases plus your Golden Case = 11 total, distributed across the 4 agencies, with varied Priority and Type values. The remaining labs now have realistic data to build Reports, Dashboards, and Dynamic Forms against.</w:t>
+      </w:r>
+    </w:p>
+    <w:p>
+      <w:pPr>
+        <w:spacing w:before="280" w:after="80"/>
+      </w:pPr>
+      <w:r>
+        <w:rPr>
+          <w:b/>
+          <w:color w:val="1F4E79"/>
+          <w:sz w:val="28"/>
+        </w:rPr>
+        <w:t>Part 4 - What the labs ahead will do with this data</w:t>
+      </w:r>
+    </w:p>
+    <w:p>
+      <w:pPr>
+        <w:pStyle w:val="ListBullet"/>
+        <w:spacing w:after="40"/>
+      </w:pPr>
+      <w:r>
+        <w:t>Lab 2 (Dynamic Forms): the visibility rule tests use your Golden Case; the related-list components surface the seed Cases on the Account.</w:t>
+      </w:r>
+    </w:p>
+    <w:p>
+      <w:pPr>
+        <w:pStyle w:val="ListBullet"/>
+        <w:spacing w:after="40"/>
+      </w:pPr>
+      <w:r>
+        <w:t>Lab 3 (Asset Hierarchy): you'll create an Asset tree and link a Case to one of the Assets. Having 11 Cases in the org makes the lookup picker realistic.</w:t>
+      </w:r>
+    </w:p>
+    <w:p>
+      <w:pPr>
+        <w:pStyle w:val="ListBullet"/>
+        <w:spacing w:after="40"/>
+      </w:pPr>
+      <w:r>
+        <w:t>Lab 5 (Service Disruption): you'll build a Service_Disruption__c custom object with its own Record Types. Seed Cases will later get a Service Disruption lookup.</w:t>
+      </w:r>
+    </w:p>
+    <w:p>
+      <w:pPr>
+        <w:pStyle w:val="ListBullet"/>
+        <w:spacing w:after="40"/>
+      </w:pPr>
+      <w:r>
+        <w:t>Lab 6 (Platform Showcase): Reports group Service Disruptions by agency. Dashboards visualize the agency distribution.</w:t>
       </w:r>
     </w:p>
     <w:p>
@@ -721,34 +473,53 @@
     </w:p>
     <w:p>
       <w:r>
-        <w:t>Two quick checks to confirm the import worked:</w:t>
+        <w:t>Three quick checks confirm the pre-load worked:</w:t>
       </w:r>
     </w:p>
     <w:p>
       <w:pPr>
-        <w:spacing w:after="40"/>
-        <w:ind w:left="340" w:hanging="340"/>
+        <w:spacing w:after="60"/>
+        <w:ind w:left="454" w:hanging="454"/>
       </w:pPr>
       <w:r>
         <w:rPr>
           <w:b/>
         </w:rPr>
-        <w:t>1. Contacts tab: 4 Operations Dispatcher Contacts.</w:t>
+        <w:t xml:space="preserve">1. </w:t>
       </w:r>
-      <w:r/>
+      <w:r>
+        <w:t>Accounts tab: 4 MTA Accounts (NYCT, LIRR, MNR, B&amp;T).</w:t>
+      </w:r>
     </w:p>
     <w:p>
       <w:pPr>
-        <w:spacing w:after="40"/>
-        <w:ind w:left="340" w:hanging="340"/>
+        <w:spacing w:after="60"/>
+        <w:ind w:left="454" w:hanging="454"/>
       </w:pPr>
       <w:r>
         <w:rPr>
           <w:b/>
         </w:rPr>
-        <w:t>2. Cases tab, All list view: 10 seed Cases plus your Golden Case = 11 total.</w:t>
+        <w:t xml:space="preserve">2. </w:t>
       </w:r>
-      <w:r/>
+      <w:r>
+        <w:t>Contacts tab: 4 Operations Dispatcher Contacts.</w:t>
+      </w:r>
+    </w:p>
+    <w:p>
+      <w:pPr>
+        <w:spacing w:after="60"/>
+        <w:ind w:left="454" w:hanging="454"/>
+      </w:pPr>
+      <w:r>
+        <w:rPr>
+          <w:b/>
+        </w:rPr>
+        <w:t xml:space="preserve">3. </w:t>
+      </w:r>
+      <w:r>
+        <w:t>Cases tab, All list view: 10 seed Cases plus your Golden Case = 11 total.</w:t>
+      </w:r>
     </w:p>
     <w:p>
       <w:pPr>
@@ -760,43 +531,12 @@
           <w:color w:val="1F4E79"/>
           <w:sz w:val="28"/>
         </w:rPr>
-        <w:t>Common sticking points</w:t>
+        <w:t>If any records are missing</w:t>
       </w:r>
     </w:p>
     <w:p>
-      <w:pPr>
-        <w:pStyle w:val="ListBullet"/>
-        <w:spacing w:after="40"/>
-      </w:pPr>
       <w:r>
-        <w:t>Record Type column maps but Cases load without a Record Type. Cause: the Record Type column value does not match any Developer Name in your org. Fix: open the CSV, confirm values are NYCT / LIRR / MNR / BandT exactly (case-sensitive, no spaces).</w:t>
-      </w:r>
-    </w:p>
-    <w:p>
-      <w:pPr>
-        <w:pStyle w:val="ListBullet"/>
-        <w:spacing w:after="40"/>
-      </w:pPr>
-      <w:r>
-        <w:t>Contact Last Name mapping fails. Cause: two Contacts share the same last name in your org. Fix: unlikely for this workshop since each MTA Contact has a unique last name. If it happens, update the CSV to use a more specific lookup field.</w:t>
-      </w:r>
-    </w:p>
-    <w:p>
-      <w:pPr>
-        <w:pStyle w:val="ListBullet"/>
-        <w:spacing w:after="40"/>
-      </w:pPr>
-      <w:r>
-        <w:t>Import takes more than a minute to complete. Normal for the first import in a new org. Salesforce queues it and emails you the summary. Open the next part of the lab while waiting.</w:t>
-      </w:r>
-    </w:p>
-    <w:p>
-      <w:pPr>
-        <w:pStyle w:val="ListBullet"/>
-        <w:spacing w:after="40"/>
-      </w:pPr>
-      <w:r>
-        <w:t>CSV columns do not auto-map. Cause: column headers in the CSV do not match any Salesforce field name. Fix: use the Edit Mapping link next to each unmapped column and pick the right destination field.</w:t>
+        <w:t>Tell your instructor. Missing records mean the pre-workshop deploy did not run cleanly on your org. The instructor can rerun the 01b-mta-sample-data loader against your org in about 10 seconds. In the meantime, you can continue to Lab 2 using the Golden Case; the seed records aren't blockers for Lab 2's main teaching moments.</w:t>
       </w:r>
     </w:p>
     <w:p>
@@ -814,7 +554,7 @@
     </w:p>
     <w:p>
       <w:r>
-        <w:t>Lab 2 opens Lightning App Builder and configures Dynamic Forms. The sample Cases you just loaded will populate the Related Lists you build. Grab water, stretch, and continue.</w:t>
+        <w:t>Lab 2 opens Lightning App Builder and configures Dynamic Forms visibility rules against your Golden Case. The seed Cases populate the Related Lists you build. Grab water, stretch, and continue.</w:t>
       </w:r>
     </w:p>
     <w:sectPr>

</xml_diff>